<commit_message>
Publish authoritative assessment tools
</commit_message>
<xml_diff>
--- a/STARLAB_Unit_3/Teaching Guides/00_Unit_3_Overview_and_Preparation.docx
+++ b/STARLAB_Unit_3/Teaching Guides/00_Unit_3_Overview_and_Preparation.docx
@@ -1889,6 +1889,19 @@
           <w:rtl w:val="0"/>
         </w:rPr>
         <w:t xml:space="preserve">Research journal format or digital documentation system</w:t>
+      </w:r>
+    </w:p>
+    <w:p>
+      <w:pPr>
+        <w:numPr>
+          <w:ilvl w:val="0"/>
+          <w:numId w:val="86"/>
+        </w:numPr>
+        <w:spacing w:after="0" w:afterAutospacing="0" w:before="0" w:beforeAutospacing="0" w:lineRule="auto"/>
+        <w:ind w:left="720" w:hanging="360"/>
+      </w:pPr>
+      <w:r>
+        <w:t>Appendix V: Research Journal Rubric (authoritative teacher scoring tool)</w:t>
       </w:r>
     </w:p>
     <w:p>

</xml_diff>